<commit_message>
Regenerate Demo_Rehearsal_Script.docx with bridge-URL caveat
Co-Authored-By: Claude Sonnet 5.5 <noreply@anthropic.com>
Claude-Session: https://claude.ai/code/session_01TxmjJ4EsD9qc4x8hD4GWz3
</commit_message>
<xml_diff>
--- a/reports/Demo_Rehearsal_Script.docx
+++ b/reports/Demo_Rehearsal_Script.docx
@@ -216,6 +216,31 @@
       </w:pPr>
       <w:r>
         <w:t xml:space="preserve">Both are started the same way you've been running them all along — the Browser pane, or by hand if you're rehearsing outside this session. Nothing below needs internet access; it all runs on your own machine.</w:t>
+      </w:r>
+    </w:p>
+    <w:p>
+      <w:pPr>
+        <w:spacing w:after="160"/>
+      </w:pPr>
+      <w:r>
+        <w:rPr>
+          <w:b/>
+          <w:bCs/>
+          <w:color w:val="B03A2E"/>
+          <w:sz w:val="20"/>
+          <w:szCs w:val="20"/>
+        </w:rPr>
+        <w:t xml:space="preserve">⚠ </w:t>
+      </w:r>
+      <w:r>
+        <w:rPr>
+          <w:b/>
+          <w:bCs/>
+          <w:color w:val="B03A2E"/>
+          <w:sz w:val="20"/>
+          <w:szCs w:val="20"/>
+        </w:rPr>
+        <w:t xml:space="preserve">MRA fiscalisation needs a reachable bridge URL. http://localhost:5059 only works when LedgerBooks and the bridge run on the same machine — it will not work from the Render production site; for that, deploy the bridge to a public URL and use that in Settings instead.</w:t>
       </w:r>
     </w:p>
     <w:p>

</xml_diff>